<commit_message>
Route Guard In Word.docs
</commit_message>
<xml_diff>
--- a/EshopByArdookhani.docx
+++ b/EshopByArdookhani.docx
@@ -9914,7 +9914,7 @@
           <w:rtl/>
           <w:lang w:bidi="fa-IR"/>
         </w:rPr>
-        <w:t>37</w:t>
+        <w:t>38</w:t>
       </w:r>
       <w:r>
         <w:rPr>
@@ -9934,6 +9934,91 @@
         <w:bidi/>
         <w:rPr>
           <w:rFonts w:cs="B Nazanin"/>
+          <w:rtl/>
+          <w:lang w:bidi="fa-IR"/>
+        </w:rPr>
+      </w:pPr>
+      <w:r>
+        <w:rPr>
+          <w:rFonts w:cs="B Nazanin" w:hint="cs"/>
+          <w:rtl/>
+          <w:lang w:bidi="fa-IR"/>
+        </w:rPr>
+        <w:t xml:space="preserve">پیاده سازی </w:t>
+      </w:r>
+      <w:r>
+        <w:rPr>
+          <w:rFonts w:cs="B Nazanin"/>
+          <w:lang w:bidi="fa-IR"/>
+        </w:rPr>
+        <w:t>Route Guard</w:t>
+      </w:r>
+      <w:r>
+        <w:rPr>
+          <w:rFonts w:cs="B Nazanin" w:hint="cs"/>
+          <w:rtl/>
+          <w:lang w:bidi="fa-IR"/>
+        </w:rPr>
+        <w:t xml:space="preserve"> در این جلسه انجام می شود .</w:t>
+      </w:r>
+    </w:p>
+    <w:p>
+      <w:pPr>
+        <w:bidi/>
+        <w:jc w:val="both"/>
+        <w:rPr>
+          <w:rFonts w:cs="B Nazanin"/>
+          <w:b/>
+          <w:bCs/>
+          <w:sz w:val="36"/>
+          <w:szCs w:val="36"/>
+          <w:rtl/>
+          <w:lang w:bidi="fa-IR"/>
+        </w:rPr>
+      </w:pPr>
+      <w:r>
+        <w:rPr>
+          <w:rFonts w:cs="B Nazanin" w:hint="cs"/>
+          <w:b/>
+          <w:bCs/>
+          <w:sz w:val="36"/>
+          <w:szCs w:val="36"/>
+          <w:rtl/>
+          <w:lang w:bidi="fa-IR"/>
+        </w:rPr>
+        <w:t xml:space="preserve">--------------------جلسه </w:t>
+      </w:r>
+      <w:r>
+        <w:rPr>
+          <w:rFonts w:cs="B Nazanin" w:hint="cs"/>
+          <w:b/>
+          <w:bCs/>
+          <w:sz w:val="36"/>
+          <w:szCs w:val="36"/>
+          <w:rtl/>
+          <w:lang w:bidi="fa-IR"/>
+        </w:rPr>
+        <w:t>39</w:t>
+      </w:r>
+      <w:r>
+        <w:rPr>
+          <w:rFonts w:cs="B Nazanin" w:hint="cs"/>
+          <w:b/>
+          <w:bCs/>
+          <w:sz w:val="36"/>
+          <w:szCs w:val="36"/>
+          <w:rtl/>
+          <w:lang w:bidi="fa-IR"/>
+        </w:rPr>
+        <w:t>-------------------------</w:t>
+      </w:r>
+    </w:p>
+    <w:p>
+      <w:pPr>
+        <w:bidi/>
+        <w:rPr>
+          <w:rFonts w:cs="B Nazanin" w:hint="cs"/>
+          <w:rtl/>
           <w:lang w:bidi="fa-IR"/>
         </w:rPr>
       </w:pPr>
@@ -11267,7 +11352,7 @@
   <w:style w:type="paragraph" w:default="1" w:styleId="Normal">
     <w:name w:val="Normal"/>
     <w:qFormat/>
-    <w:rsid w:val="00A812D6"/>
+    <w:rsid w:val="00F735BA"/>
   </w:style>
   <w:style w:type="paragraph" w:styleId="Heading3">
     <w:name w:val="heading 3"/>

</xml_diff>